<commit_message>
docs: remove devops/jenkins-ci branch references from GitHub task documentation
</commit_message>
<xml_diff>
--- a/TASK_1_GITHUB_DOCUMENTATION_SHORT.docx
+++ b/TASK_1_GITHUB_DOCUMENTATION_SHORT.docx
@@ -533,7 +533,7 @@
                 <w:color w:val="1E293B"/>
                 <w:sz w:val="18"/>
               </w:rPr>
-              <w:t>main (production), sprint-7-8 (reporting feature branch), sprint-9, devops/jenkins-ci</w:t>
+              <w:t>main (production), sprint-7-8 (reporting feature branch), sprint-9</w:t>
             </w:r>
           </w:p>
         </w:tc>
@@ -2421,7 +2421,7 @@
                 <w:color w:val="F1F5F9"/>
                 <w:sz w:val="17"/>
               </w:rPr>
-              <w:t>18e95db HEAD@{2}: checkout: moving from devops/jenkins-ci to main</w:t>
+              <w:t>18e95db HEAD@{2}: checkout: moving from sprint-7-8 to main</w:t>
             </w:r>
           </w:p>
         </w:tc>
@@ -3122,7 +3122,7 @@
         <w:rPr>
           <w:color w:val="1E293B"/>
         </w:rPr>
-        <w:t>Active Remote Branches: 'main' (default production), 'sprint-7-8', 'sprint-9', 'devops/jenkins-ci'.</w:t>
+        <w:t>Active Remote Branches: 'main' (default production), 'sprint-7-8', 'sprint-9'.</w:t>
       </w:r>
     </w:p>
     <w:p>

</xml_diff>